<commit_message>
docs(dev): match DES table titles and centred page footer
Co-Authored-By: Claude Opus 5.5 <noreply@anthropic.com>
</commit_message>
<xml_diff>
--- a/docs/dev/DEV-01 Model Baseline Development.docx
+++ b/docs/dev/DEV-01 Model Baseline Development.docx
@@ -156,15 +156,15 @@
     <w:p>
       <w:pPr>
         <w:keepNext/>
-        <w:spacing w:after="80" w:before="120"/>
+        <w:spacing w:after="80" w:before="160"/>
       </w:pPr>
       <w:r>
         <w:rPr>
           <w:rFonts w:ascii="Arial" w:cs="Arial" w:eastAsia="Arial" w:hAnsi="Arial"/>
-          <w:i/>
-          <w:iCs/>
-          <w:sz w:val="18"/>
-          <w:szCs w:val="18"/>
+          <w:b/>
+          <w:bCs/>
+          <w:sz w:val="22"/>
+          <w:szCs w:val="22"/>
         </w:rPr>
         <w:t xml:space="preserve">Table 1. Prediction problem</w:t>
       </w:r>
@@ -825,15 +825,15 @@
     <w:p>
       <w:pPr>
         <w:keepNext/>
-        <w:spacing w:after="80" w:before="120"/>
+        <w:spacing w:after="80" w:before="160"/>
       </w:pPr>
       <w:r>
         <w:rPr>
           <w:rFonts w:ascii="Arial" w:cs="Arial" w:eastAsia="Arial" w:hAnsi="Arial"/>
-          <w:i/>
-          <w:iCs/>
-          <w:sz w:val="18"/>
-          <w:szCs w:val="18"/>
+          <w:b/>
+          <w:bCs/>
+          <w:sz w:val="22"/>
+          <w:szCs w:val="22"/>
         </w:rPr>
         <w:t xml:space="preserve">Table 2. Input features</w:t>
       </w:r>
@@ -1969,15 +1969,15 @@
     <w:p>
       <w:pPr>
         <w:keepNext/>
-        <w:spacing w:after="80" w:before="120"/>
+        <w:spacing w:after="80" w:before="160"/>
       </w:pPr>
       <w:r>
         <w:rPr>
           <w:rFonts w:ascii="Arial" w:cs="Arial" w:eastAsia="Arial" w:hAnsi="Arial"/>
-          <w:i/>
-          <w:iCs/>
-          <w:sz w:val="18"/>
-          <w:szCs w:val="18"/>
+          <w:b/>
+          <w:bCs/>
+          <w:sz w:val="22"/>
+          <w:szCs w:val="22"/>
         </w:rPr>
         <w:t xml:space="preserve">Table 3. Simulation assumptions per office</w:t>
       </w:r>
@@ -2784,15 +2784,15 @@
     <w:p>
       <w:pPr>
         <w:keepNext/>
-        <w:spacing w:after="80" w:before="120"/>
+        <w:spacing w:after="80" w:before="160"/>
       </w:pPr>
       <w:r>
         <w:rPr>
           <w:rFonts w:ascii="Arial" w:cs="Arial" w:eastAsia="Arial" w:hAnsi="Arial"/>
-          <w:i/>
-          <w:iCs/>
-          <w:sz w:val="18"/>
-          <w:szCs w:val="18"/>
+          <w:b/>
+          <w:bCs/>
+          <w:sz w:val="22"/>
+          <w:szCs w:val="22"/>
         </w:rPr>
         <w:t xml:space="preserve">Table 4. Rows at each stage</w:t>
       </w:r>
@@ -3344,15 +3344,15 @@
     <w:p>
       <w:pPr>
         <w:keepNext/>
-        <w:spacing w:after="80" w:before="120"/>
+        <w:spacing w:after="80" w:before="160"/>
       </w:pPr>
       <w:r>
         <w:rPr>
           <w:rFonts w:ascii="Arial" w:cs="Arial" w:eastAsia="Arial" w:hAnsi="Arial"/>
-          <w:i/>
-          <w:iCs/>
-          <w:sz w:val="18"/>
-          <w:szCs w:val="18"/>
+          <w:b/>
+          <w:bCs/>
+          <w:sz w:val="22"/>
+          <w:szCs w:val="22"/>
         </w:rPr>
         <w:t xml:space="preserve">Table 5. Baseline results on the test set (392 requests)</w:t>
       </w:r>
@@ -4229,7 +4229,7 @@
 <w:ftr xmlns:wpc="http://schemas.microsoft.com/office/word/2010/wordprocessingCanvas" xmlns:mc="http://schemas.openxmlformats.org/markup-compatibility/2006" xmlns:o="urn:schemas-microsoft-com:office:office" xmlns:r="http://schemas.openxmlformats.org/officeDocument/2006/relationships" xmlns:m="http://schemas.openxmlformats.org/officeDocument/2006/math" xmlns:v="urn:schemas-microsoft-com:vml" xmlns:wp14="http://schemas.microsoft.com/office/word/2010/wordprocessingDrawing" xmlns:wp="http://schemas.openxmlformats.org/drawingml/2006/wordprocessingDrawing" xmlns:w10="urn:schemas-microsoft-com:office:word" xmlns:w="http://schemas.openxmlformats.org/wordprocessingml/2006/main" xmlns:w14="http://schemas.microsoft.com/office/word/2010/wordml" xmlns:w15="http://schemas.microsoft.com/office/word/2012/wordml" xmlns:wpg="http://schemas.microsoft.com/office/word/2010/wordprocessingGroup" xmlns:wpi="http://schemas.microsoft.com/office/word/2010/wordprocessingInk" xmlns:wne="http://schemas.microsoft.com/office/word/2006/wordml" xmlns:wps="http://schemas.microsoft.com/office/word/2010/wordprocessingShape">
   <w:p>
     <w:pPr>
-      <w:jc w:val="right"/>
+      <w:jc w:val="center"/>
     </w:pPr>
     <w:r>
       <w:rPr>

</xml_diff>

<commit_message>
docs(dev): simple linear regression baseline and confidence in the write-ups
DEV-01 now presents the simple linear regression baseline with the
average as the Objective 5 reference; DEV-02 adds the confidence section
(range coverage, Brier score, calibration) and corrects the example's
routing day to Sunday; DEV-04 documents likely_range, late_probability
and confidence with fresh staging responses; DEV-05 covers the borderline
badge with new screenshots.

Co-Authored-By: Claude Opus 5.5 <noreply@anthropic.com>
</commit_message>
<xml_diff>
--- a/docs/dev/DEV-01 Model Baseline Development.docx
+++ b/docs/dev/DEV-01 Model Baseline Development.docx
@@ -76,7 +76,25 @@
           <w:sz w:val="22"/>
           <w:szCs w:val="22"/>
         </w:rPr>
-        <w:t xml:space="preserve">Objective 5 asks that the model be compared with simple average-based reporting. This document defines the prediction problem and builds that baseline. DEV-02 trains the linear regression model that must beat it.</w:t>
+        <w:t xml:space="preserve">This document defines the prediction problem and builds the </w:t>
+      </w:r>
+      <w:r>
+        <w:rPr>
+          <w:rFonts w:ascii="Arial" w:cs="Arial" w:eastAsia="Arial" w:hAnsi="Arial"/>
+          <w:b/>
+          <w:bCs/>
+          <w:sz w:val="22"/>
+          <w:szCs w:val="22"/>
+        </w:rPr>
+        <w:t xml:space="preserve">baseline model</w:t>
+      </w:r>
+      <w:r>
+        <w:rPr>
+          <w:rFonts w:ascii="Arial" w:cs="Arial" w:eastAsia="Arial" w:hAnsi="Arial"/>
+          <w:sz w:val="22"/>
+          <w:szCs w:val="22"/>
+        </w:rPr>
+        <w:t xml:space="preserve">: a simple linear regression that predicts turnaround from the credential's processing days alone, which is the target the registrar already sets. Chapter 1, Objective 5 also asks for a comparison with simple average-based reporting, so the plain average is kept as a reference. DEV-02 trains the core model that must beat both.</w:t>
       </w:r>
     </w:p>
     <w:p>
@@ -381,7 +399,7 @@
                 <w:sz w:val="18"/>
                 <w:szCs w:val="18"/>
               </w:rPr>
-              <w:t xml:space="preserve">10 values known at routing time (Table 2)</w:t>
+              <w:t xml:space="preserve">Baseline: processing days only. Core model: 10 values known at routing time (Table 2)</w:t>
             </w:r>
           </w:p>
         </w:tc>
@@ -551,7 +569,7 @@
                 <w:sz w:val="18"/>
                 <w:szCs w:val="18"/>
               </w:rPr>
-              <w:t xml:space="preserve">Mean predictor: always predicts the average turnaround of the training set</w:t>
+              <w:t xml:space="preserve">Simple linear regression: turnaround = a + b x processing days</w:t>
             </w:r>
           </w:p>
         </w:tc>
@@ -586,6 +604,71 @@
                 <w:sz w:val="18"/>
                 <w:szCs w:val="18"/>
               </w:rPr>
+              <w:t xml:space="preserve">Reference</w:t>
+            </w:r>
+          </w:p>
+        </w:tc>
+        <w:tc>
+          <w:tcPr>
+            <w:tcW w:type="dxa" w:w="6760"/>
+            <w:tcBorders>
+              <w:top w:val="single" w:color="999999" w:sz="4"/>
+              <w:left w:val="single" w:color="999999" w:sz="4"/>
+              <w:bottom w:val="single" w:color="999999" w:sz="4"/>
+              <w:right w:val="single" w:color="999999" w:sz="4"/>
+            </w:tcBorders>
+            <w:tcMar>
+              <w:top w:type="dxa" w:w="50"/>
+              <w:left w:type="dxa" w:w="90"/>
+              <w:bottom w:type="dxa" w:w="50"/>
+              <w:right w:type="dxa" w:w="90"/>
+            </w:tcMar>
+          </w:tcPr>
+          <w:p>
+            <w:pPr>
+              <w:keepNext/>
+            </w:pPr>
+            <w:r>
+              <w:rPr>
+                <w:rFonts w:ascii="Arial" w:cs="Arial" w:eastAsia="Arial" w:hAnsi="Arial"/>
+                <w:sz w:val="18"/>
+                <w:szCs w:val="18"/>
+              </w:rPr>
+              <w:t xml:space="preserve">Average-based reporting: the training average for every request (Objective 5)</w:t>
+            </w:r>
+          </w:p>
+        </w:tc>
+      </w:tr>
+      <w:tr>
+        <w:trPr>
+          <w:cantSplit/>
+        </w:trPr>
+        <w:tc>
+          <w:tcPr>
+            <w:tcW w:type="dxa" w:w="2600"/>
+            <w:tcBorders>
+              <w:top w:val="single" w:color="999999" w:sz="4"/>
+              <w:left w:val="single" w:color="999999" w:sz="4"/>
+              <w:bottom w:val="single" w:color="999999" w:sz="4"/>
+              <w:right w:val="single" w:color="999999" w:sz="4"/>
+            </w:tcBorders>
+            <w:tcMar>
+              <w:top w:type="dxa" w:w="50"/>
+              <w:left w:type="dxa" w:w="90"/>
+              <w:bottom w:type="dxa" w:w="50"/>
+              <w:right w:type="dxa" w:w="90"/>
+            </w:tcMar>
+          </w:tcPr>
+          <w:p>
+            <w:pPr>
+              <w:keepNext/>
+            </w:pPr>
+            <w:r>
+              <w:rPr>
+                <w:rFonts w:ascii="Arial" w:cs="Arial" w:eastAsia="Arial" w:hAnsi="Arial"/>
+                <w:sz w:val="18"/>
+                <w:szCs w:val="18"/>
+              </w:rPr>
               <w:t xml:space="preserve">Core model</w:t>
             </w:r>
           </w:p>
@@ -616,7 +699,7 @@
                 <w:sz w:val="18"/>
                 <w:szCs w:val="18"/>
               </w:rPr>
-              <w:t xml:space="preserve">Linear regression (DEV-02)</w:t>
+              <w:t xml:space="preserve">Multiple linear regression on all 10 features (DEV-02)</w:t>
             </w:r>
           </w:p>
         </w:tc>
@@ -3282,7 +3365,7 @@
           <w:sz w:val="20"/>
           <w:szCs w:val="20"/>
         </w:rPr>
-        <w:t xml:space="preserve">DummyRegressor(strategy="mean")</w:t>
+        <w:t xml:space="preserve">LinearRegression</w:t>
       </w:r>
       <w:r>
         <w:rPr>
@@ -3290,7 +3373,23 @@
           <w:sz w:val="22"/>
           <w:szCs w:val="22"/>
         </w:rPr>
-        <w:t xml:space="preserve">. It ignores every feature and predicts the training average for every request, which is exactly what "average-based reporting" does when the registrar says "requests take about 8 days".</w:t>
+        <w:t xml:space="preserve"> fitted on one feature, the credential's processing days. It answers the simplest sensible question: if the registrar's own target were the only information, how long would a request take? Fitted on the training set it learned:</w:t>
+      </w:r>
+    </w:p>
+    <w:p>
+      <w:pPr>
+        <w:keepNext w:val="false"/>
+        <w:keepLines/>
+        <w:shd w:fill="F5F5F5" w:color="auto" w:val="clear"/>
+        <w:spacing w:after="200" w:before="80"/>
+      </w:pPr>
+      <w:r>
+        <w:rPr>
+          <w:rFonts w:ascii="Courier New" w:cs="Courier New" w:eastAsia="Courier New" w:hAnsi="Courier New"/>
+          <w:sz w:val="17"/>
+          <w:szCs w:val="17"/>
+        </w:rPr>
+        <w:t xml:space="preserve">turnaround_days = 0.161 + 1.166 x processing_days</w:t>
       </w:r>
     </w:p>
     <w:p>
@@ -3303,7 +3402,36 @@
           <w:sz w:val="22"/>
           <w:szCs w:val="22"/>
         </w:rPr>
-        <w:t xml:space="preserve">On the training set the average turnaround is </w:t>
+        <w:t xml:space="preserve">So a 3-day Certificate of Enrollment is predicted at 3.7 days and a 10-day Transcript of Records at 11.8 days. Because turnaround is counted in calendar days and processing days in working days, the slope is a little above 1.</w:t>
+      </w:r>
+    </w:p>
+    <w:p>
+      <w:pPr>
+        <w:spacing w:after="160" w:line="276"/>
+      </w:pPr>
+      <w:r>
+        <w:rPr>
+          <w:rFonts w:ascii="Arial" w:cs="Arial" w:eastAsia="Arial" w:hAnsi="Arial"/>
+          <w:sz w:val="22"/>
+          <w:szCs w:val="22"/>
+        </w:rPr>
+        <w:t xml:space="preserve">The reference is scikit-learn's </w:t>
+      </w:r>
+      <w:r>
+        <w:rPr>
+          <w:rFonts w:ascii="Courier New" w:cs="Courier New" w:eastAsia="Courier New" w:hAnsi="Courier New"/>
+          <w:sz w:val="20"/>
+          <w:szCs w:val="20"/>
+        </w:rPr>
+        <w:t xml:space="preserve">DummyRegressor(strategy="mean")</w:t>
+      </w:r>
+      <w:r>
+        <w:rPr>
+          <w:rFonts w:ascii="Arial" w:cs="Arial" w:eastAsia="Arial" w:hAnsi="Arial"/>
+          <w:sz w:val="22"/>
+          <w:szCs w:val="22"/>
+        </w:rPr>
+        <w:t xml:space="preserve">, which predicts the training average of </w:t>
       </w:r>
       <w:r>
         <w:rPr>
@@ -3321,7 +3449,7 @@
           <w:sz w:val="22"/>
           <w:szCs w:val="22"/>
         </w:rPr>
-        <w:t xml:space="preserve">, so the baseline predicts 8.23 days for every request, whether it is a one-office Certificate of Enrollment or a five-office Honorable Dismissal.</w:t>
+        <w:t xml:space="preserve"> for every request. That is what "average-based reporting" does when the registrar says "requests take about 8 days".</w:t>
       </w:r>
     </w:p>
     <w:p>
@@ -3354,7 +3482,7 @@
           <w:sz w:val="22"/>
           <w:szCs w:val="22"/>
         </w:rPr>
-        <w:t xml:space="preserve">Table 5. Baseline results on the test set (392 requests)</w:t>
+        <w:t xml:space="preserve">Table 5. Results on the test set (392 requests)</w:t>
       </w:r>
     </w:p>
     <w:tbl>
@@ -3370,9 +3498,10 @@
         </w:tblBorders>
       </w:tblPr>
       <w:tblGrid>
-        <w:gridCol w:w="2200"/>
         <w:gridCol w:w="1900"/>
-        <w:gridCol w:w="5260"/>
+        <w:gridCol w:w="2000"/>
+        <w:gridCol w:w="2000"/>
+        <w:gridCol w:w="3460"/>
       </w:tblGrid>
       <w:tr>
         <w:trPr>
@@ -3380,7 +3509,7 @@
         </w:trPr>
         <w:tc>
           <w:tcPr>
-            <w:tcW w:type="dxa" w:w="2200"/>
+            <w:tcW w:type="dxa" w:w="1900"/>
             <w:tcBorders>
               <w:top w:val="single" w:color="999999" w:sz="4"/>
               <w:left w:val="single" w:color="999999" w:sz="4"/>
@@ -3413,7 +3542,7 @@
         </w:tc>
         <w:tc>
           <w:tcPr>
-            <w:tcW w:type="dxa" w:w="1900"/>
+            <w:tcW w:type="dxa" w:w="2000"/>
             <w:tcBorders>
               <w:top w:val="single" w:color="999999" w:sz="4"/>
               <w:left w:val="single" w:color="999999" w:sz="4"/>
@@ -3440,13 +3569,46 @@
                 <w:sz w:val="18"/>
                 <w:szCs w:val="18"/>
               </w:rPr>
-              <w:t xml:space="preserve">Value</w:t>
-            </w:r>
-          </w:p>
-        </w:tc>
-        <w:tc>
-          <w:tcPr>
-            <w:tcW w:type="dxa" w:w="5260"/>
+              <w:t xml:space="preserve">Reference (average)</w:t>
+            </w:r>
+          </w:p>
+        </w:tc>
+        <w:tc>
+          <w:tcPr>
+            <w:tcW w:type="dxa" w:w="2000"/>
+            <w:tcBorders>
+              <w:top w:val="single" w:color="999999" w:sz="4"/>
+              <w:left w:val="single" w:color="999999" w:sz="4"/>
+              <w:bottom w:val="single" w:color="999999" w:sz="4"/>
+              <w:right w:val="single" w:color="999999" w:sz="4"/>
+            </w:tcBorders>
+            <w:shd w:fill="EFEFEF" w:color="auto" w:val="clear"/>
+            <w:tcMar>
+              <w:top w:type="dxa" w:w="50"/>
+              <w:left w:type="dxa" w:w="90"/>
+              <w:bottom w:type="dxa" w:w="50"/>
+              <w:right w:type="dxa" w:w="90"/>
+            </w:tcMar>
+          </w:tcPr>
+          <w:p>
+            <w:pPr>
+              <w:keepNext/>
+            </w:pPr>
+            <w:r>
+              <w:rPr>
+                <w:rFonts w:ascii="Arial" w:cs="Arial" w:eastAsia="Arial" w:hAnsi="Arial"/>
+                <w:b/>
+                <w:bCs/>
+                <w:sz w:val="18"/>
+                <w:szCs w:val="18"/>
+              </w:rPr>
+              <w:t xml:space="preserve">Baseline (simple LR)</w:t>
+            </w:r>
+          </w:p>
+        </w:tc>
+        <w:tc>
+          <w:tcPr>
+            <w:tcW w:type="dxa" w:w="3460"/>
             <w:tcBorders>
               <w:top w:val="single" w:color="999999" w:sz="4"/>
               <w:left w:val="single" w:color="999999" w:sz="4"/>
@@ -3484,7 +3646,7 @@
         </w:trPr>
         <w:tc>
           <w:tcPr>
-            <w:tcW w:type="dxa" w:w="2200"/>
+            <w:tcW w:type="dxa" w:w="1900"/>
             <w:tcBorders>
               <w:top w:val="single" w:color="999999" w:sz="4"/>
               <w:left w:val="single" w:color="999999" w:sz="4"/>
@@ -3514,7 +3676,7 @@
         </w:tc>
         <w:tc>
           <w:tcPr>
-            <w:tcW w:type="dxa" w:w="1900"/>
+            <w:tcW w:type="dxa" w:w="2000"/>
             <w:tcBorders>
               <w:top w:val="single" w:color="999999" w:sz="4"/>
               <w:left w:val="single" w:color="999999" w:sz="4"/>
@@ -3544,31 +3706,61 @@
         </w:tc>
         <w:tc>
           <w:tcPr>
-            <w:tcW w:type="dxa" w:w="5260"/>
-            <w:tcBorders>
-              <w:top w:val="single" w:color="999999" w:sz="4"/>
-              <w:left w:val="single" w:color="999999" w:sz="4"/>
-              <w:bottom w:val="single" w:color="999999" w:sz="4"/>
-              <w:right w:val="single" w:color="999999" w:sz="4"/>
-            </w:tcBorders>
-            <w:tcMar>
-              <w:top w:type="dxa" w:w="50"/>
-              <w:left w:type="dxa" w:w="90"/>
-              <w:bottom w:type="dxa" w:w="50"/>
-              <w:right w:type="dxa" w:w="90"/>
-            </w:tcMar>
-          </w:tcPr>
-          <w:p>
-            <w:pPr>
-              <w:keepNext/>
-            </w:pPr>
-            <w:r>
-              <w:rPr>
-                <w:rFonts w:ascii="Arial" w:cs="Arial" w:eastAsia="Arial" w:hAnsi="Arial"/>
-                <w:sz w:val="18"/>
-                <w:szCs w:val="18"/>
-              </w:rPr>
-              <w:t xml:space="preserve">On average the guess is off by 4.4 days</w:t>
+            <w:tcW w:type="dxa" w:w="2000"/>
+            <w:tcBorders>
+              <w:top w:val="single" w:color="999999" w:sz="4"/>
+              <w:left w:val="single" w:color="999999" w:sz="4"/>
+              <w:bottom w:val="single" w:color="999999" w:sz="4"/>
+              <w:right w:val="single" w:color="999999" w:sz="4"/>
+            </w:tcBorders>
+            <w:tcMar>
+              <w:top w:type="dxa" w:w="50"/>
+              <w:left w:type="dxa" w:w="90"/>
+              <w:bottom w:type="dxa" w:w="50"/>
+              <w:right w:type="dxa" w:w="90"/>
+            </w:tcMar>
+          </w:tcPr>
+          <w:p>
+            <w:pPr>
+              <w:keepNext/>
+            </w:pPr>
+            <w:r>
+              <w:rPr>
+                <w:rFonts w:ascii="Arial" w:cs="Arial" w:eastAsia="Arial" w:hAnsi="Arial"/>
+                <w:sz w:val="18"/>
+                <w:szCs w:val="18"/>
+              </w:rPr>
+              <w:t xml:space="preserve">3.441 days</w:t>
+            </w:r>
+          </w:p>
+        </w:tc>
+        <w:tc>
+          <w:tcPr>
+            <w:tcW w:type="dxa" w:w="3460"/>
+            <w:tcBorders>
+              <w:top w:val="single" w:color="999999" w:sz="4"/>
+              <w:left w:val="single" w:color="999999" w:sz="4"/>
+              <w:bottom w:val="single" w:color="999999" w:sz="4"/>
+              <w:right w:val="single" w:color="999999" w:sz="4"/>
+            </w:tcBorders>
+            <w:tcMar>
+              <w:top w:type="dxa" w:w="50"/>
+              <w:left w:type="dxa" w:w="90"/>
+              <w:bottom w:type="dxa" w:w="50"/>
+              <w:right w:type="dxa" w:w="90"/>
+            </w:tcMar>
+          </w:tcPr>
+          <w:p>
+            <w:pPr>
+              <w:keepNext/>
+            </w:pPr>
+            <w:r>
+              <w:rPr>
+                <w:rFonts w:ascii="Arial" w:cs="Arial" w:eastAsia="Arial" w:hAnsi="Arial"/>
+                <w:sz w:val="18"/>
+                <w:szCs w:val="18"/>
+              </w:rPr>
+              <w:t xml:space="preserve">Average size of the error in days</w:t>
             </w:r>
           </w:p>
         </w:tc>
@@ -3579,7 +3771,7 @@
         </w:trPr>
         <w:tc>
           <w:tcPr>
-            <w:tcW w:type="dxa" w:w="2200"/>
+            <w:tcW w:type="dxa" w:w="1900"/>
             <w:tcBorders>
               <w:top w:val="single" w:color="999999" w:sz="4"/>
               <w:left w:val="single" w:color="999999" w:sz="4"/>
@@ -3609,7 +3801,7 @@
         </w:tc>
         <w:tc>
           <w:tcPr>
-            <w:tcW w:type="dxa" w:w="1900"/>
+            <w:tcW w:type="dxa" w:w="2000"/>
             <w:tcBorders>
               <w:top w:val="single" w:color="999999" w:sz="4"/>
               <w:left w:val="single" w:color="999999" w:sz="4"/>
@@ -3639,31 +3831,61 @@
         </w:tc>
         <w:tc>
           <w:tcPr>
-            <w:tcW w:type="dxa" w:w="5260"/>
-            <w:tcBorders>
-              <w:top w:val="single" w:color="999999" w:sz="4"/>
-              <w:left w:val="single" w:color="999999" w:sz="4"/>
-              <w:bottom w:val="single" w:color="999999" w:sz="4"/>
-              <w:right w:val="single" w:color="999999" w:sz="4"/>
-            </w:tcBorders>
-            <w:tcMar>
-              <w:top w:type="dxa" w:w="50"/>
-              <w:left w:type="dxa" w:w="90"/>
-              <w:bottom w:type="dxa" w:w="50"/>
-              <w:right w:type="dxa" w:w="90"/>
-            </w:tcMar>
-          </w:tcPr>
-          <w:p>
-            <w:pPr>
-              <w:keepNext/>
-            </w:pPr>
-            <w:r>
-              <w:rPr>
-                <w:rFonts w:ascii="Arial" w:cs="Arial" w:eastAsia="Arial" w:hAnsi="Arial"/>
-                <w:sz w:val="18"/>
-                <w:szCs w:val="18"/>
-              </w:rPr>
-              <w:t xml:space="preserve">Large misses are common</w:t>
+            <w:tcW w:type="dxa" w:w="2000"/>
+            <w:tcBorders>
+              <w:top w:val="single" w:color="999999" w:sz="4"/>
+              <w:left w:val="single" w:color="999999" w:sz="4"/>
+              <w:bottom w:val="single" w:color="999999" w:sz="4"/>
+              <w:right w:val="single" w:color="999999" w:sz="4"/>
+            </w:tcBorders>
+            <w:tcMar>
+              <w:top w:type="dxa" w:w="50"/>
+              <w:left w:type="dxa" w:w="90"/>
+              <w:bottom w:type="dxa" w:w="50"/>
+              <w:right w:type="dxa" w:w="90"/>
+            </w:tcMar>
+          </w:tcPr>
+          <w:p>
+            <w:pPr>
+              <w:keepNext/>
+            </w:pPr>
+            <w:r>
+              <w:rPr>
+                <w:rFonts w:ascii="Arial" w:cs="Arial" w:eastAsia="Arial" w:hAnsi="Arial"/>
+                <w:sz w:val="18"/>
+                <w:szCs w:val="18"/>
+              </w:rPr>
+              <w:t xml:space="preserve">4.768 days</w:t>
+            </w:r>
+          </w:p>
+        </w:tc>
+        <w:tc>
+          <w:tcPr>
+            <w:tcW w:type="dxa" w:w="3460"/>
+            <w:tcBorders>
+              <w:top w:val="single" w:color="999999" w:sz="4"/>
+              <w:left w:val="single" w:color="999999" w:sz="4"/>
+              <w:bottom w:val="single" w:color="999999" w:sz="4"/>
+              <w:right w:val="single" w:color="999999" w:sz="4"/>
+            </w:tcBorders>
+            <w:tcMar>
+              <w:top w:type="dxa" w:w="50"/>
+              <w:left w:type="dxa" w:w="90"/>
+              <w:bottom w:type="dxa" w:w="50"/>
+              <w:right w:type="dxa" w:w="90"/>
+            </w:tcMar>
+          </w:tcPr>
+          <w:p>
+            <w:pPr>
+              <w:keepNext/>
+            </w:pPr>
+            <w:r>
+              <w:rPr>
+                <w:rFonts w:ascii="Arial" w:cs="Arial" w:eastAsia="Arial" w:hAnsi="Arial"/>
+                <w:sz w:val="18"/>
+                <w:szCs w:val="18"/>
+              </w:rPr>
+              <w:t xml:space="preserve">Like MAE but punishes large misses more</w:t>
             </w:r>
           </w:p>
         </w:tc>
@@ -3674,7 +3896,7 @@
         </w:trPr>
         <w:tc>
           <w:tcPr>
-            <w:tcW w:type="dxa" w:w="2200"/>
+            <w:tcW w:type="dxa" w:w="1900"/>
             <w:tcBorders>
               <w:top w:val="single" w:color="999999" w:sz="4"/>
               <w:left w:val="single" w:color="999999" w:sz="4"/>
@@ -3704,7 +3926,7 @@
         </w:tc>
         <w:tc>
           <w:tcPr>
-            <w:tcW w:type="dxa" w:w="1900"/>
+            <w:tcW w:type="dxa" w:w="2000"/>
             <w:tcBorders>
               <w:top w:val="single" w:color="999999" w:sz="4"/>
               <w:left w:val="single" w:color="999999" w:sz="4"/>
@@ -3734,31 +3956,61 @@
         </w:tc>
         <w:tc>
           <w:tcPr>
-            <w:tcW w:type="dxa" w:w="5260"/>
-            <w:tcBorders>
-              <w:top w:val="single" w:color="999999" w:sz="4"/>
-              <w:left w:val="single" w:color="999999" w:sz="4"/>
-              <w:bottom w:val="single" w:color="999999" w:sz="4"/>
-              <w:right w:val="single" w:color="999999" w:sz="4"/>
-            </w:tcBorders>
-            <w:tcMar>
-              <w:top w:type="dxa" w:w="50"/>
-              <w:left w:type="dxa" w:w="90"/>
-              <w:bottom w:type="dxa" w:w="50"/>
-              <w:right w:type="dxa" w:w="90"/>
-            </w:tcMar>
-          </w:tcPr>
-          <w:p>
-            <w:pPr>
-              <w:keepNext/>
-            </w:pPr>
-            <w:r>
-              <w:rPr>
-                <w:rFonts w:ascii="Arial" w:cs="Arial" w:eastAsia="Arial" w:hAnsi="Arial"/>
-                <w:sz w:val="18"/>
-                <w:szCs w:val="18"/>
-              </w:rPr>
-              <w:t xml:space="preserve">Explains none of the differences between requests (by definition)</w:t>
+            <w:tcW w:type="dxa" w:w="2000"/>
+            <w:tcBorders>
+              <w:top w:val="single" w:color="999999" w:sz="4"/>
+              <w:left w:val="single" w:color="999999" w:sz="4"/>
+              <w:bottom w:val="single" w:color="999999" w:sz="4"/>
+              <w:right w:val="single" w:color="999999" w:sz="4"/>
+            </w:tcBorders>
+            <w:tcMar>
+              <w:top w:type="dxa" w:w="50"/>
+              <w:left w:type="dxa" w:w="90"/>
+              <w:bottom w:type="dxa" w:w="50"/>
+              <w:right w:type="dxa" w:w="90"/>
+            </w:tcMar>
+          </w:tcPr>
+          <w:p>
+            <w:pPr>
+              <w:keepNext/>
+            </w:pPr>
+            <w:r>
+              <w:rPr>
+                <w:rFonts w:ascii="Arial" w:cs="Arial" w:eastAsia="Arial" w:hAnsi="Arial"/>
+                <w:sz w:val="18"/>
+                <w:szCs w:val="18"/>
+              </w:rPr>
+              <w:t xml:space="preserve">0.337</w:t>
+            </w:r>
+          </w:p>
+        </w:tc>
+        <w:tc>
+          <w:tcPr>
+            <w:tcW w:type="dxa" w:w="3460"/>
+            <w:tcBorders>
+              <w:top w:val="single" w:color="999999" w:sz="4"/>
+              <w:left w:val="single" w:color="999999" w:sz="4"/>
+              <w:bottom w:val="single" w:color="999999" w:sz="4"/>
+              <w:right w:val="single" w:color="999999" w:sz="4"/>
+            </w:tcBorders>
+            <w:tcMar>
+              <w:top w:type="dxa" w:w="50"/>
+              <w:left w:type="dxa" w:w="90"/>
+              <w:bottom w:type="dxa" w:w="50"/>
+              <w:right w:type="dxa" w:w="90"/>
+            </w:tcMar>
+          </w:tcPr>
+          <w:p>
+            <w:pPr>
+              <w:keepNext/>
+            </w:pPr>
+            <w:r>
+              <w:rPr>
+                <w:rFonts w:ascii="Arial" w:cs="Arial" w:eastAsia="Arial" w:hAnsi="Arial"/>
+                <w:sz w:val="18"/>
+                <w:szCs w:val="18"/>
+              </w:rPr>
+              <w:t xml:space="preserve">Share of the differences between requests explained</w:t>
             </w:r>
           </w:p>
         </w:tc>
@@ -3769,7 +4021,7 @@
         </w:trPr>
         <w:tc>
           <w:tcPr>
-            <w:tcW w:type="dxa" w:w="2200"/>
+            <w:tcW w:type="dxa" w:w="1900"/>
             <w:tcBorders>
               <w:top w:val="single" w:color="999999" w:sz="4"/>
               <w:left w:val="single" w:color="999999" w:sz="4"/>
@@ -3799,7 +4051,7 @@
         </w:tc>
         <w:tc>
           <w:tcPr>
-            <w:tcW w:type="dxa" w:w="1900"/>
+            <w:tcW w:type="dxa" w:w="2000"/>
             <w:tcBorders>
               <w:top w:val="single" w:color="999999" w:sz="4"/>
               <w:left w:val="single" w:color="999999" w:sz="4"/>
@@ -3829,31 +4081,61 @@
         </w:tc>
         <w:tc>
           <w:tcPr>
-            <w:tcW w:type="dxa" w:w="5260"/>
-            <w:tcBorders>
-              <w:top w:val="single" w:color="999999" w:sz="4"/>
-              <w:left w:val="single" w:color="999999" w:sz="4"/>
-              <w:bottom w:val="single" w:color="999999" w:sz="4"/>
-              <w:right w:val="single" w:color="999999" w:sz="4"/>
-            </w:tcBorders>
-            <w:tcMar>
-              <w:top w:type="dxa" w:w="50"/>
-              <w:left w:type="dxa" w:w="90"/>
-              <w:bottom w:type="dxa" w:w="50"/>
-              <w:right w:type="dxa" w:w="90"/>
-            </w:tcMar>
-          </w:tcPr>
-          <w:p>
-            <w:pPr>
-              <w:keepNext/>
-            </w:pPr>
-            <w:r>
-              <w:rPr>
-                <w:rFonts w:ascii="Arial" w:cs="Arial" w:eastAsia="Arial" w:hAnsi="Arial"/>
-                <w:sz w:val="18"/>
-                <w:szCs w:val="18"/>
-              </w:rPr>
-              <w:t xml:space="preserve">Of 192 requests flagged, only 37% were really late</w:t>
+            <w:tcW w:type="dxa" w:w="2000"/>
+            <w:tcBorders>
+              <w:top w:val="single" w:color="999999" w:sz="4"/>
+              <w:left w:val="single" w:color="999999" w:sz="4"/>
+              <w:bottom w:val="single" w:color="999999" w:sz="4"/>
+              <w:right w:val="single" w:color="999999" w:sz="4"/>
+            </w:tcBorders>
+            <w:tcMar>
+              <w:top w:type="dxa" w:w="50"/>
+              <w:left w:type="dxa" w:w="90"/>
+              <w:bottom w:type="dxa" w:w="50"/>
+              <w:right w:type="dxa" w:w="90"/>
+            </w:tcMar>
+          </w:tcPr>
+          <w:p>
+            <w:pPr>
+              <w:keepNext/>
+            </w:pPr>
+            <w:r>
+              <w:rPr>
+                <w:rFonts w:ascii="Arial" w:cs="Arial" w:eastAsia="Arial" w:hAnsi="Arial"/>
+                <w:sz w:val="18"/>
+                <w:szCs w:val="18"/>
+              </w:rPr>
+              <w:t xml:space="preserve">0.378</w:t>
+            </w:r>
+          </w:p>
+        </w:tc>
+        <w:tc>
+          <w:tcPr>
+            <w:tcW w:type="dxa" w:w="3460"/>
+            <w:tcBorders>
+              <w:top w:val="single" w:color="999999" w:sz="4"/>
+              <w:left w:val="single" w:color="999999" w:sz="4"/>
+              <w:bottom w:val="single" w:color="999999" w:sz="4"/>
+              <w:right w:val="single" w:color="999999" w:sz="4"/>
+            </w:tcBorders>
+            <w:tcMar>
+              <w:top w:type="dxa" w:w="50"/>
+              <w:left w:type="dxa" w:w="90"/>
+              <w:bottom w:type="dxa" w:w="50"/>
+              <w:right w:type="dxa" w:w="90"/>
+            </w:tcMar>
+          </w:tcPr>
+          <w:p>
+            <w:pPr>
+              <w:keepNext/>
+            </w:pPr>
+            <w:r>
+              <w:rPr>
+                <w:rFonts w:ascii="Arial" w:cs="Arial" w:eastAsia="Arial" w:hAnsi="Arial"/>
+                <w:sz w:val="18"/>
+                <w:szCs w:val="18"/>
+              </w:rPr>
+              <w:t xml:space="preserve">Of the flagged requests, the share really late</w:t>
             </w:r>
           </w:p>
         </w:tc>
@@ -3864,7 +4146,7 @@
         </w:trPr>
         <w:tc>
           <w:tcPr>
-            <w:tcW w:type="dxa" w:w="2200"/>
+            <w:tcW w:type="dxa" w:w="1900"/>
             <w:tcBorders>
               <w:top w:val="single" w:color="999999" w:sz="4"/>
               <w:left w:val="single" w:color="999999" w:sz="4"/>
@@ -3894,7 +4176,7 @@
         </w:tc>
         <w:tc>
           <w:tcPr>
-            <w:tcW w:type="dxa" w:w="1900"/>
+            <w:tcW w:type="dxa" w:w="2000"/>
             <w:tcBorders>
               <w:top w:val="single" w:color="999999" w:sz="4"/>
               <w:left w:val="single" w:color="999999" w:sz="4"/>
@@ -3924,31 +4206,61 @@
         </w:tc>
         <w:tc>
           <w:tcPr>
-            <w:tcW w:type="dxa" w:w="5260"/>
-            <w:tcBorders>
-              <w:top w:val="single" w:color="999999" w:sz="4"/>
-              <w:left w:val="single" w:color="999999" w:sz="4"/>
-              <w:bottom w:val="single" w:color="999999" w:sz="4"/>
-              <w:right w:val="single" w:color="999999" w:sz="4"/>
-            </w:tcBorders>
-            <w:tcMar>
-              <w:top w:type="dxa" w:w="50"/>
-              <w:left w:type="dxa" w:w="90"/>
-              <w:bottom w:type="dxa" w:w="50"/>
-              <w:right w:type="dxa" w:w="90"/>
-            </w:tcMar>
-          </w:tcPr>
-          <w:p>
-            <w:pPr>
-              <w:keepNext/>
-            </w:pPr>
-            <w:r>
-              <w:rPr>
-                <w:rFonts w:ascii="Arial" w:cs="Arial" w:eastAsia="Arial" w:hAnsi="Arial"/>
-                <w:sz w:val="18"/>
-                <w:szCs w:val="18"/>
-              </w:rPr>
-              <w:t xml:space="preserve">Caught 55% of the 127 requests that were really late</w:t>
+            <w:tcW w:type="dxa" w:w="2000"/>
+            <w:tcBorders>
+              <w:top w:val="single" w:color="999999" w:sz="4"/>
+              <w:left w:val="single" w:color="999999" w:sz="4"/>
+              <w:bottom w:val="single" w:color="999999" w:sz="4"/>
+              <w:right w:val="single" w:color="999999" w:sz="4"/>
+            </w:tcBorders>
+            <w:tcMar>
+              <w:top w:type="dxa" w:w="50"/>
+              <w:left w:type="dxa" w:w="90"/>
+              <w:bottom w:type="dxa" w:w="50"/>
+              <w:right w:type="dxa" w:w="90"/>
+            </w:tcMar>
+          </w:tcPr>
+          <w:p>
+            <w:pPr>
+              <w:keepNext/>
+            </w:pPr>
+            <w:r>
+              <w:rPr>
+                <w:rFonts w:ascii="Arial" w:cs="Arial" w:eastAsia="Arial" w:hAnsi="Arial"/>
+                <w:sz w:val="18"/>
+                <w:szCs w:val="18"/>
+              </w:rPr>
+              <w:t xml:space="preserve">0.110</w:t>
+            </w:r>
+          </w:p>
+        </w:tc>
+        <w:tc>
+          <w:tcPr>
+            <w:tcW w:type="dxa" w:w="3460"/>
+            <w:tcBorders>
+              <w:top w:val="single" w:color="999999" w:sz="4"/>
+              <w:left w:val="single" w:color="999999" w:sz="4"/>
+              <w:bottom w:val="single" w:color="999999" w:sz="4"/>
+              <w:right w:val="single" w:color="999999" w:sz="4"/>
+            </w:tcBorders>
+            <w:tcMar>
+              <w:top w:type="dxa" w:w="50"/>
+              <w:left w:type="dxa" w:w="90"/>
+              <w:bottom w:type="dxa" w:w="50"/>
+              <w:right w:type="dxa" w:w="90"/>
+            </w:tcMar>
+          </w:tcPr>
+          <w:p>
+            <w:pPr>
+              <w:keepNext/>
+            </w:pPr>
+            <w:r>
+              <w:rPr>
+                <w:rFonts w:ascii="Arial" w:cs="Arial" w:eastAsia="Arial" w:hAnsi="Arial"/>
+                <w:sz w:val="18"/>
+                <w:szCs w:val="18"/>
+              </w:rPr>
+              <w:t xml:space="preserve">Of the 127 really late requests, the share flagged</w:t>
             </w:r>
           </w:p>
         </w:tc>
@@ -3959,7 +4271,7 @@
         </w:trPr>
         <w:tc>
           <w:tcPr>
-            <w:tcW w:type="dxa" w:w="2200"/>
+            <w:tcW w:type="dxa" w:w="1900"/>
             <w:tcBorders>
               <w:top w:val="single" w:color="999999" w:sz="4"/>
               <w:left w:val="single" w:color="999999" w:sz="4"/>
@@ -3989,7 +4301,7 @@
         </w:tc>
         <w:tc>
           <w:tcPr>
-            <w:tcW w:type="dxa" w:w="1900"/>
+            <w:tcW w:type="dxa" w:w="2000"/>
             <w:tcBorders>
               <w:top w:val="single" w:color="999999" w:sz="4"/>
               <w:left w:val="single" w:color="999999" w:sz="4"/>
@@ -4019,7 +4331,37 @@
         </w:tc>
         <w:tc>
           <w:tcPr>
-            <w:tcW w:type="dxa" w:w="5260"/>
+            <w:tcW w:type="dxa" w:w="2000"/>
+            <w:tcBorders>
+              <w:top w:val="single" w:color="999999" w:sz="4"/>
+              <w:left w:val="single" w:color="999999" w:sz="4"/>
+              <w:bottom w:val="single" w:color="999999" w:sz="4"/>
+              <w:right w:val="single" w:color="999999" w:sz="4"/>
+            </w:tcBorders>
+            <w:tcMar>
+              <w:top w:type="dxa" w:w="50"/>
+              <w:left w:type="dxa" w:w="90"/>
+              <w:bottom w:type="dxa" w:w="50"/>
+              <w:right w:type="dxa" w:w="90"/>
+            </w:tcMar>
+          </w:tcPr>
+          <w:p>
+            <w:pPr>
+              <w:keepNext/>
+            </w:pPr>
+            <w:r>
+              <w:rPr>
+                <w:rFonts w:ascii="Arial" w:cs="Arial" w:eastAsia="Arial" w:hAnsi="Arial"/>
+                <w:sz w:val="18"/>
+                <w:szCs w:val="18"/>
+              </w:rPr>
+              <w:t xml:space="preserve">0.171</w:t>
+            </w:r>
+          </w:p>
+        </w:tc>
+        <w:tc>
+          <w:tcPr>
+            <w:tcW w:type="dxa" w:w="3460"/>
             <w:tcBorders>
               <w:top w:val="single" w:color="999999" w:sz="4"/>
               <w:left w:val="single" w:color="999999" w:sz="4"/>
@@ -4064,7 +4406,7 @@
           <w:sz w:val="22"/>
           <w:szCs w:val="22"/>
         </w:rPr>
-        <w:t xml:space="preserve">For the at-risk flag, the baseline flags a request when 8.23 days is later than its due date. It therefore flags every short-deadline credential and none of the long ones, which explains its low precision. These numbers are the bar the linear regression model in DEV-02 must clear.</w:t>
+        <w:t xml:space="preserve">The baseline predicts the days better than the average (MAE 3.441 against 4.405, R² 0.337), so processing days alone already explain about a third of the variation. It is a poor early warning, though: because its prediction rises in step with the due date, it almost never predicts a request past its deadline and flags only 37 of 392 requests (recall 0.110). Telling which requests will be late needs the offices, the requester and the workload, which is what the core model in DEV-02 adds.</w:t>
       </w:r>
     </w:p>
     <w:p>

</xml_diff>